<commit_message>
Rebuild Ch06 Bleeding Kansas worksheets: add student work + teacher answer keys
Co-Authored-By: Claude Opus 4.8 <noreply@anthropic.com>
Claude-Session: https://claude.ai/code/session_015FDXZfxhU1Z58uEGaySNHv
</commit_message>
<xml_diff>
--- a/Part-Two-Ch06-Bleeding-Kansas/Dred Scott.docx
+++ b/Part-Two-Ch06-Bleeding-Kansas/Dred Scott.docx
@@ -9,25 +9,22 @@
         <w:tblLook w:firstColumn="1" w:firstRow="1" w:lastColumn="0" w:lastRow="0" w:noHBand="0" w:noVBand="1" w:val="04A0"/>
       </w:tblPr>
       <w:tblGrid>
-        <w:gridCol w:w="9936"/>
+        <w:gridCol w:w="10224"/>
       </w:tblGrid>
       <w:tr>
         <w:tc>
           <w:tcPr>
-            <w:tcW w:type="dxa" w:w="9936"/>
+            <w:tcW w:type="dxa" w:w="10224"/>
             <w:shd w:val="clear" w:fill="B1442F"/>
           </w:tcPr>
           <w:p>
-            <w:pPr>
-              <w:jc w:val="left"/>
-            </w:pPr>
             <w:r>
               <w:rPr>
                 <w:b/>
                 <w:color w:val="FFE6DE"/>
                 <w:sz w:val="18"/>
               </w:rPr>
-              <w:t>CHAPTER 6 · DEEP DIVE · HOUSE &amp; DIVIDED</w:t>
+              <w:t>PROMISE &amp; PRACTICE  ·  DEEP DIVE  ·  SOURCE ANALYSIS</w:t>
             </w:r>
           </w:p>
           <w:p>
@@ -35,18 +32,19 @@
               <w:rPr>
                 <w:b/>
                 <w:color w:val="FFFFFF"/>
-                <w:sz w:val="40"/>
+                <w:sz w:val="42"/>
               </w:rPr>
-              <w:t>Dred Scott</w:t>
+              <w:t>Dred Scott — House &amp; Divided</w:t>
             </w:r>
           </w:p>
           <w:p>
             <w:r>
               <w:rPr>
+                <w:i/>
                 <w:color w:val="FFE6DE"/>
-                <w:sz w:val="21"/>
+                <w:sz w:val="22"/>
               </w:rPr>
-              <w:t>The Supreme Court tried to settle slavery forever — and pushed the country closer to war instead. 1857.</w:t>
+              <w:t>What the Court Actually Said</w:t>
             </w:r>
           </w:p>
         </w:tc>
@@ -64,7 +62,7 @@
         <w:rPr>
           <w:sz w:val="21"/>
         </w:rPr>
-        <w:t xml:space="preserve">__________________________    </w:t>
+        <w:t xml:space="preserve">______________________________    </w:t>
       </w:r>
       <w:r>
         <w:rPr>
@@ -90,30 +88,153 @@
         <w:rPr>
           <w:sz w:val="21"/>
         </w:rPr>
-        <w:t>______________</w:t>
+        <w:t>________________</w:t>
+      </w:r>
+    </w:p>
+    <w:tbl>
+      <w:tblPr>
+        <w:tblW w:type="auto" w:w="0"/>
+        <w:tblLayout w:type="autofit"/>
+        <w:tblLook w:firstColumn="1" w:firstRow="1" w:lastColumn="0" w:lastRow="0" w:noHBand="0" w:noVBand="1" w:val="04A0"/>
+      </w:tblPr>
+      <w:tblGrid>
+        <w:gridCol w:w="10224"/>
+      </w:tblGrid>
+      <w:tr>
+        <w:tc>
+          <w:tcPr>
+            <w:tcW w:type="dxa" w:w="10224"/>
+            <w:shd w:val="clear" w:fill="f4c04e"/>
+          </w:tcPr>
+          <w:p>
+            <w:r>
+              <w:rPr>
+                <w:b/>
+                <w:color w:val="5A4512"/>
+                <w:sz w:val="19"/>
+              </w:rPr>
+              <w:t xml:space="preserve">WHAT I CAN DO TODAY   </w:t>
+            </w:r>
+            <w:r>
+              <w:rPr>
+                <w:color w:val="5A4512"/>
+                <w:sz w:val="21"/>
+              </w:rPr>
+              <w:t>I can read primary sources about Dred Scott — House &amp; Divided, weigh who made each one and why, and use evidence to answer historical questions.</w:t>
+            </w:r>
+          </w:p>
+        </w:tc>
+      </w:tr>
+    </w:tbl>
+    <w:p>
+      <w:r>
+        <w:rPr>
+          <w:b/>
+          <w:color w:val="B1442F"/>
+        </w:rPr>
+        <w:t xml:space="preserve">Directions. </w:t>
+      </w:r>
+      <w:r>
+        <w:rPr>
+          <w:sz w:val="22"/>
+        </w:rPr>
+        <w:t>A ruling is a primary source like any other. Read the majority opinion and the dissent, and pin down exactly what each one argues</w:t>
       </w:r>
     </w:p>
     <w:p/>
     <w:p>
       <w:r>
         <w:rPr>
+          <w:b/>
+          <w:color w:val="B1442F"/>
+          <w:sz w:val="26"/>
+        </w:rPr>
+        <w:t>THE SOURCES</w:t>
+      </w:r>
+    </w:p>
+    <w:p>
+      <w:pPr>
+        <w:spacing w:before="160"/>
+      </w:pPr>
+      <w:r>
+        <w:rPr>
+          <w:b/>
+          <w:color w:val="1C1714"/>
+          <w:sz w:val="23"/>
+        </w:rPr>
+        <w:t>SOURCE A · THE MAJORITY · CHIEF JUSTICE TANEY  —  The Court's decision</w:t>
+      </w:r>
+    </w:p>
+    <w:p>
+      <w:pPr>
+        <w:ind w:left="432"/>
+      </w:pPr>
+      <w:r>
+        <w:rPr>
           <w:i/>
           <w:color w:val="1C1714"/>
           <w:sz w:val="22"/>
         </w:rPr>
-        <w:t>The Supreme Court tried to settle slavery forever — and pushed the country closer to war instead. 1857.</w:t>
+        <w:t>“[Black Americans] had for more than a century before been regarded as beings of an inferior order … so far inferior, that they had no rights which the white man was bound to respect. … [The Missouri Compromise, banning slavery in the territories,] is not warranted by the Constitution, and is therefore void.”</w:t>
+        <w:br/>
+        <w:t>— Dred Scott v. Sandford, majority opinion, 1857. Public domain</w:t>
+      </w:r>
+    </w:p>
+    <w:p>
+      <w:r>
+        <w:rPr>
+          <w:color w:val="6A6256"/>
+          <w:sz w:val="17"/>
+        </w:rPr>
+        <w:t>— Dred Scott v. Sandford, majority opinion, 1857. Public domain.</w:t>
       </w:r>
     </w:p>
     <w:p>
       <w:pPr>
-        <w:spacing w:after="80"/>
+        <w:spacing w:before="160"/>
       </w:pPr>
       <w:r>
         <w:rPr>
+          <w:b/>
           <w:color w:val="1C1714"/>
           <w:sz w:val="23"/>
         </w:rPr>
-        <w:t>What happens when the highest court in the land tries to end a political fight by law — and gets it catastrophically wrong?</w:t>
+        <w:t>SOURCE B · THE DISSENT · JUSTICE BENJAMIN CURTIS  —  The justice who disagreed</w:t>
+      </w:r>
+    </w:p>
+    <w:p>
+      <w:pPr>
+        <w:ind w:left="432"/>
+      </w:pPr>
+      <w:r>
+        <w:rPr>
+          <w:i/>
+          <w:color w:val="1C1714"/>
+          <w:sz w:val="22"/>
+        </w:rPr>
+        <w:t>“At the time of the ratification of the … Constitution, all free native-born inhabitants of … New Hampshire, Massachusetts, New York, New Jersey, and North Carolina, though descended from African slaves, were not only citizens of those States, but such of them as had the other necessary qualifications possessed the franchise of electors [the right to vote] … on equal terms with other citizens.”</w:t>
+        <w:br/>
+        <w:t>— Dred Scott v. Sandford, Curtis dissent, 1857. Public domain</w:t>
+      </w:r>
+    </w:p>
+    <w:p>
+      <w:r>
+        <w:rPr>
+          <w:color w:val="6A6256"/>
+          <w:sz w:val="17"/>
+        </w:rPr>
+        <w:t>— Dred Scott v. Sandford, Curtis dissent, 1857. Public domain.</w:t>
+      </w:r>
+    </w:p>
+    <w:p/>
+    <w:p>
+      <w:r>
+        <w:rPr>
+          <w:b/>
+          <w:color w:val="B1442F"/>
+          <w:sz w:val="26"/>
+        </w:rPr>
+        <w:t>YOUR WORK</w:t>
       </w:r>
     </w:p>
     <w:p>
@@ -123,54 +244,65 @@
       <w:r>
         <w:rPr>
           <w:b/>
-          <w:color w:val="B1442F"/>
-          <w:sz w:val="28"/>
+          <w:color w:val="FFFFFF"/>
+          <w:sz w:val="20"/>
+          <w:shd w:val="clear" w:fill="B1442F"/>
         </w:rPr>
-        <w:t>Who Was Dred Scott?</w:t>
+        <w:t xml:space="preserve">  QUESTION 1  </w:t>
+      </w:r>
+      <w:r>
+        <w:rPr>
+          <w:b/>
+          <w:color w:val="6A6256"/>
+          <w:sz w:val="18"/>
+        </w:rPr>
+        <w:t xml:space="preserve">   STEP 1 · WHAT IT SAYS</w:t>
       </w:r>
     </w:p>
     <w:p>
       <w:r>
         <w:rPr>
-          <w:b/>
-          <w:color w:val="6A6256"/>
-          <w:sz w:val="17"/>
+          <w:b w:val="0"/>
+          <w:color w:val="1C1714"/>
+          <w:sz w:val="23"/>
         </w:rPr>
-        <w:t>THE MAN</w:t>
+        <w:t>Source A shut three doors (see the lesson). In your own words, list the three things the Court decided.</w:t>
       </w:r>
     </w:p>
     <w:p>
       <w:pPr>
-        <w:spacing w:after="80"/>
+        <w:spacing w:after="120"/>
       </w:pPr>
       <w:r>
         <w:rPr>
-          <w:color w:val="1C1714"/>
-          <w:sz w:val="23"/>
+          <w:color w:val="9A9286"/>
+          <w:sz w:val="22"/>
         </w:rPr>
-        <w:t>Dred Scott was an enslaved man whose owner, an army doctor, had taken him to live for years in Illinois and the Wisconsin Territory — where slavery was illegal.</w:t>
+        <w:t>____________________________________________________________________________________________</w:t>
       </w:r>
     </w:p>
     <w:p>
       <w:pPr>
-        <w:spacing w:after="80"/>
+        <w:spacing w:after="120"/>
       </w:pPr>
       <w:r>
         <w:rPr>
-          <w:color w:val="1C1714"/>
-          <w:sz w:val="23"/>
+          <w:color w:val="9A9286"/>
+          <w:sz w:val="22"/>
         </w:rPr>
-        <w:t>When they returned to Missouri, Scott sued for his freedom, arguing a simple point: living on free soil had made him free. His case climbed all the way to the Supreme Court.</w:t>
+        <w:t>____________________________________________________________________________________________</w:t>
       </w:r>
     </w:p>
     <w:p>
+      <w:pPr>
+        <w:spacing w:after="120"/>
+      </w:pPr>
       <w:r>
         <w:rPr>
-          <w:i/>
-          <w:color w:val="6A6256"/>
-          <w:sz w:val="17"/>
+          <w:color w:val="9A9286"/>
+          <w:sz w:val="22"/>
         </w:rPr>
-        <w:t>Dred Scott — photograph, c. 1857, public domain (Library of Congress / Missouri Historical Society).</w:t>
+        <w:t>____________________________________________________________________________________________</w:t>
       </w:r>
     </w:p>
     <w:p>
@@ -180,40 +312,65 @@
       <w:r>
         <w:rPr>
           <w:b/>
-          <w:color w:val="B1442F"/>
-          <w:sz w:val="28"/>
+          <w:color w:val="FFFFFF"/>
+          <w:sz w:val="20"/>
+          <w:shd w:val="clear" w:fill="B1442F"/>
         </w:rPr>
-        <w:t>Dred Scott</w:t>
+        <w:t xml:space="preserve">  QUESTION 2  </w:t>
+      </w:r>
+      <w:r>
+        <w:rPr>
+          <w:b/>
+          <w:color w:val="6A6256"/>
+          <w:sz w:val="18"/>
+        </w:rPr>
+        <w:t xml:space="preserve">   STEP 2 · SOURCE AGAINST SOURCE</w:t>
       </w:r>
     </w:p>
     <w:p>
       <w:r>
         <w:rPr>
-          <w:b/>
-          <w:color w:val="6A6256"/>
-          <w:sz w:val="17"/>
+          <w:b w:val="0"/>
+          <w:color w:val="1C1714"/>
+          <w:sz w:val="23"/>
         </w:rPr>
-        <w:t>THE PLAINTIFF</w:t>
+        <w:t>Taney claims Black Americans were never meant to be citizens. How does Justice Curtis's dissent (Source B) directly disprove that claim with historical evidence?</w:t>
       </w:r>
     </w:p>
     <w:p>
+      <w:pPr>
+        <w:spacing w:after="120"/>
+      </w:pPr>
       <w:r>
         <w:rPr>
-          <w:i/>
-          <w:color w:val="1C1714"/>
+          <w:color w:val="9A9286"/>
           <w:sz w:val="22"/>
         </w:rPr>
-        <w:t>He asked the courts one question: if I lived for years where slavery was banned, am I not free?</w:t>
+        <w:t>____________________________________________________________________________________________</w:t>
       </w:r>
     </w:p>
     <w:p>
+      <w:pPr>
+        <w:spacing w:after="120"/>
+      </w:pPr>
       <w:r>
         <w:rPr>
-          <w:i/>
-          <w:color w:val="6A6256"/>
-          <w:sz w:val="17"/>
+          <w:color w:val="9A9286"/>
+          <w:sz w:val="22"/>
         </w:rPr>
-        <w:t>Dred Scott — photograph, c. 1857, public domain (Library of Congress / Missouri Historical Society).</w:t>
+        <w:t>____________________________________________________________________________________________</w:t>
+      </w:r>
+    </w:p>
+    <w:p>
+      <w:pPr>
+        <w:spacing w:after="120"/>
+      </w:pPr>
+      <w:r>
+        <w:rPr>
+          <w:color w:val="9A9286"/>
+          <w:sz w:val="22"/>
+        </w:rPr>
+        <w:t>____________________________________________________________________________________________</w:t>
       </w:r>
     </w:p>
     <w:p>
@@ -223,54 +380,77 @@
       <w:r>
         <w:rPr>
           <w:b/>
-          <w:color w:val="B1442F"/>
-          <w:sz w:val="28"/>
+          <w:color w:val="FFFFFF"/>
+          <w:sz w:val="20"/>
+          <w:shd w:val="clear" w:fill="B1442F"/>
         </w:rPr>
-        <w:t>Three Doors Slammed</w:t>
+        <w:t xml:space="preserve">  QUESTION 3  </w:t>
+      </w:r>
+      <w:r>
+        <w:rPr>
+          <w:b/>
+          <w:color w:val="6A6256"/>
+          <w:sz w:val="18"/>
+        </w:rPr>
+        <w:t xml:space="preserve">   STEP 2 · SOURCE AGAINST SOURCE</w:t>
       </w:r>
     </w:p>
     <w:p>
       <w:r>
         <w:rPr>
-          <w:b/>
-          <w:color w:val="6A6256"/>
-          <w:sz w:val="17"/>
+          <w:b w:val="0"/>
+          <w:color w:val="1C1714"/>
+          <w:sz w:val="23"/>
         </w:rPr>
-        <w:t>1857 · THE RULING</w:t>
+        <w:t>Why did this ruling make the Missouri Compromise — and “popular sovereignty” — suddenly meaningless?</w:t>
       </w:r>
     </w:p>
     <w:p>
       <w:pPr>
-        <w:spacing w:after="80"/>
+        <w:spacing w:after="40"/>
+        <w:ind w:left="432"/>
       </w:pPr>
       <w:r>
         <w:rPr>
-          <w:color w:val="1C1714"/>
-          <w:sz w:val="23"/>
+          <w:sz w:val="22"/>
         </w:rPr>
-        <w:t>Chief Justice Roger Taney and the Court didn't just rule against Scott. They went much further, and shut three doors at once: Black Americans could not be citizens and so could not even sue; living on free soil did not make Scott free; and Congress had no power to ban slavery in any territory — making the Missouri Compromise unconstitutional.</w:t>
+        <w:t>☐  A.  because it freed Dred Scott</w:t>
       </w:r>
     </w:p>
     <w:p>
       <w:pPr>
-        <w:spacing w:after="80"/>
+        <w:spacing w:after="40"/>
+        <w:ind w:left="432"/>
       </w:pPr>
       <w:r>
         <w:rPr>
-          <w:color w:val="1C1714"/>
-          <w:sz w:val="23"/>
+          <w:sz w:val="22"/>
         </w:rPr>
-        <w:t>In one decision, the Court declared that slavery could not be kept out of any western territory. Popular sovereignty, the Missouri Compromise, the Republican Party's whole platform — all of it, the Court said, was illegal.</w:t>
+        <w:t>☐  B.  because it only applied to Missouri</w:t>
       </w:r>
     </w:p>
     <w:p>
+      <w:pPr>
+        <w:spacing w:after="40"/>
+        <w:ind w:left="432"/>
+      </w:pPr>
       <w:r>
         <w:rPr>
-          <w:i/>
-          <w:color w:val="6A6256"/>
-          <w:sz w:val="17"/>
+          <w:sz w:val="22"/>
         </w:rPr>
-        <w:t>Roger B. Taney — photograph, public domain (Library of Congress).</w:t>
+        <w:t>☐  C.  because if slavery couldn't be banned in any territory, no law or vote could keep it out</w:t>
+      </w:r>
+    </w:p>
+    <w:p>
+      <w:pPr>
+        <w:spacing w:after="40"/>
+        <w:ind w:left="432"/>
+      </w:pPr>
+      <w:r>
+        <w:rPr>
+          <w:sz w:val="22"/>
+        </w:rPr>
+        <w:t>☐  D.  because it abolished the Supreme Court</w:t>
       </w:r>
     </w:p>
     <w:p>
@@ -280,155 +460,79 @@
       <w:r>
         <w:rPr>
           <w:b/>
-          <w:color w:val="B1442F"/>
-          <w:sz w:val="28"/>
+          <w:color w:val="FFFFFF"/>
+          <w:sz w:val="20"/>
+          <w:shd w:val="clear" w:fill="B1442F"/>
         </w:rPr>
-        <w:t>Chief Justice Roger B. Taney</w:t>
+        <w:t xml:space="preserve">  QUESTION 4  </w:t>
+      </w:r>
+      <w:r>
+        <w:rPr>
+          <w:b/>
+          <w:color w:val="6A6256"/>
+          <w:sz w:val="18"/>
+        </w:rPr>
+        <w:t xml:space="preserve">   STEP 3 · WHY IT MATTERS</w:t>
       </w:r>
     </w:p>
     <w:p>
       <w:r>
         <w:rPr>
-          <w:b/>
-          <w:color w:val="6A6256"/>
-          <w:sz w:val="17"/>
+          <w:b w:val="0"/>
+          <w:color w:val="1C1714"/>
+          <w:sz w:val="23"/>
         </w:rPr>
-        <w:t>THE AUTHOR OF THE OPINION</w:t>
-      </w:r>
-    </w:p>
-    <w:p>
-      <w:r>
-        <w:rPr>
-          <w:i/>
-          <w:color w:val="1C1714"/>
-          <w:sz w:val="22"/>
-        </w:rPr>
-        <w:t>A Southerner who hoped to end the slavery dispute for good — and instead poured fuel on it.</w:t>
-      </w:r>
-    </w:p>
-    <w:p>
-      <w:r>
-        <w:rPr>
-          <w:i/>
-          <w:color w:val="6A6256"/>
-          <w:sz w:val="17"/>
-        </w:rPr>
-        <w:t>Roger B. Taney — photograph, public domain (Library of Congress).</w:t>
-      </w:r>
-    </w:p>
-    <w:p>
-      <w:r>
-        <w:rPr>
-          <w:b/>
-          <w:color w:val="6A6256"/>
-          <w:sz w:val="17"/>
-        </w:rPr>
-        <w:t>CHIEF JUSTICE TANEY, MAJORITY OPINION · 1857</w:t>
+        <w:t>The Court hoped this ruling would end the slavery fight. Instead it made war more likely. In two or three sentences, explain why a decision meant to settle the question only inflamed it.</w:t>
       </w:r>
     </w:p>
     <w:p>
       <w:pPr>
-        <w:spacing w:after="80"/>
+        <w:spacing w:after="120"/>
       </w:pPr>
       <w:r>
         <w:rPr>
-          <w:color w:val="1C1714"/>
-          <w:sz w:val="23"/>
+          <w:color w:val="9A9286"/>
+          <w:sz w:val="22"/>
         </w:rPr>
-        <w:t>They had … been regarded as beings of an inferior order … so far inferior, that they had no rights which the white man was bound to respect.</w:t>
+        <w:t>____________________________________________________________________________________________</w:t>
       </w:r>
     </w:p>
     <w:p>
       <w:pPr>
-        <w:spacing w:before="200"/>
+        <w:spacing w:after="120"/>
       </w:pPr>
       <w:r>
         <w:rPr>
-          <w:b/>
-          <w:color w:val="B1442F"/>
-          <w:sz w:val="28"/>
+          <w:color w:val="9A9286"/>
+          <w:sz w:val="22"/>
         </w:rPr>
-        <w:t>A Decision That Settled Nothing</w:t>
-      </w:r>
-    </w:p>
-    <w:p>
-      <w:r>
-        <w:rPr>
-          <w:b/>
-          <w:color w:val="6A6256"/>
-          <w:sz w:val="17"/>
-        </w:rPr>
-        <w:t>THE BACKLASH</w:t>
+        <w:t>____________________________________________________________________________________________</w:t>
       </w:r>
     </w:p>
     <w:p>
       <w:pPr>
-        <w:spacing w:after="80"/>
+        <w:spacing w:after="120"/>
       </w:pPr>
       <w:r>
         <w:rPr>
-          <w:color w:val="1C1714"/>
-          <w:sz w:val="23"/>
+          <w:color w:val="9A9286"/>
+          <w:sz w:val="22"/>
         </w:rPr>
-        <w:t>The South rejoiced; the North was enraged. Far from ending the argument, the ruling convinced many Northerners that a “Slave Power” now controlled the courts, the presidency, and the Constitution itself.</w:t>
+        <w:t>____________________________________________________________________________________________</w:t>
       </w:r>
     </w:p>
     <w:p>
       <w:pPr>
-        <w:spacing w:after="80"/>
+        <w:spacing w:after="120"/>
       </w:pPr>
       <w:r>
         <w:rPr>
-          <w:color w:val="1C1714"/>
-          <w:sz w:val="23"/>
+          <w:color w:val="9A9286"/>
+          <w:sz w:val="22"/>
         </w:rPr>
-        <w:t>It made the Republican Party stronger, not weaker — and it made compromise look impossible. If even the Supreme Court said slavery could go anywhere, what was left to negotiate?</w:t>
+        <w:t>____________________________________________________________________________________________</w:t>
       </w:r>
     </w:p>
-    <w:p>
-      <w:r>
-        <w:rPr>
-          <w:i/>
-          <w:color w:val="6A6256"/>
-          <w:sz w:val="17"/>
-        </w:rPr>
-        <w:t>Roger B. Taney — photograph, public domain (Library of Congress).</w:t>
-      </w:r>
-    </w:p>
-    <w:p>
-      <w:pPr>
-        <w:spacing w:before="200"/>
-      </w:pPr>
-      <w:r>
-        <w:rPr>
-          <w:b/>
-          <w:color w:val="B1442F"/>
-          <w:sz w:val="28"/>
-        </w:rPr>
-        <w:t>Read the Ruling</w:t>
-      </w:r>
-    </w:p>
-    <w:p>
-      <w:r>
-        <w:rPr>
-          <w:b/>
-          <w:color w:val="6A6256"/>
-          <w:sz w:val="17"/>
-        </w:rPr>
-        <w:t>YOUR TURN</w:t>
-      </w:r>
-    </w:p>
-    <w:p>
-      <w:r>
-        <w:rPr>
-          <w:i/>
-          <w:color w:val="1C1714"/>
-          <w:sz w:val="22"/>
-        </w:rPr>
-        <w:t>You'll read Taney's own words and the words of the justice who dissented — and practice the historian's skill of document analysis: figuring out exactly what a source claims, and what it leaves out.</w:t>
-      </w:r>
-    </w:p>
-    <w:p/>
     <w:p>
       <w:pPr>
         <w:jc w:val="center"/>
@@ -441,9 +545,160 @@
         <w:t>Promise &amp; Practice · ShadowDog Digital Studios · Unit 2</w:t>
       </w:r>
     </w:p>
+    <w:p>
+      <w:r>
+        <w:br w:type="page"/>
+      </w:r>
+    </w:p>
+    <w:tbl>
+      <w:tblPr>
+        <w:tblW w:type="auto" w:w="0"/>
+        <w:tblLayout w:type="autofit"/>
+        <w:tblLook w:firstColumn="1" w:firstRow="1" w:lastColumn="0" w:lastRow="0" w:noHBand="0" w:noVBand="1" w:val="04A0"/>
+      </w:tblPr>
+      <w:tblGrid>
+        <w:gridCol w:w="10224"/>
+      </w:tblGrid>
+      <w:tr>
+        <w:tc>
+          <w:tcPr>
+            <w:tcW w:type="dxa" w:w="10224"/>
+            <w:shd w:val="clear" w:fill="2c2219"/>
+          </w:tcPr>
+          <w:p>
+            <w:r>
+              <w:rPr>
+                <w:b/>
+                <w:color w:val="F0A184"/>
+                <w:sz w:val="28"/>
+              </w:rPr>
+              <w:t>TEACHER ANSWER KEY  —  Dred Scott — House &amp; Divided</w:t>
+            </w:r>
+          </w:p>
+        </w:tc>
+      </w:tr>
+    </w:tbl>
+    <w:p/>
+    <w:p>
+      <w:r>
+        <w:rPr>
+          <w:b/>
+          <w:color w:val="B1442F"/>
+          <w:sz w:val="22"/>
+        </w:rPr>
+        <w:t xml:space="preserve">QUESTION 1:  </w:t>
+      </w:r>
+      <w:r>
+        <w:rPr>
+          <w:sz w:val="22"/>
+        </w:rPr>
+        <w:t>Open response.</w:t>
+      </w:r>
+    </w:p>
+    <w:p>
+      <w:pPr>
+        <w:ind w:left="432"/>
+      </w:pPr>
+      <w:r>
+        <w:rPr>
+          <w:i/>
+          <w:color w:val="6A6256"/>
+          <w:sz w:val="21"/>
+        </w:rPr>
+        <w:t>Look for a response along the lines of: “1) … 2) … 3) …”</w:t>
+      </w:r>
+    </w:p>
+    <w:p>
+      <w:r>
+        <w:rPr>
+          <w:b/>
+          <w:color w:val="B1442F"/>
+          <w:sz w:val="22"/>
+        </w:rPr>
+        <w:t xml:space="preserve">QUESTION 2:  </w:t>
+      </w:r>
+      <w:r>
+        <w:rPr>
+          <w:sz w:val="22"/>
+        </w:rPr>
+        <w:t>Open response.</w:t>
+      </w:r>
+    </w:p>
+    <w:p>
+      <w:pPr>
+        <w:ind w:left="432"/>
+      </w:pPr>
+      <w:r>
+        <w:rPr>
+          <w:i/>
+          <w:color w:val="6A6256"/>
+          <w:sz w:val="21"/>
+        </w:rPr>
+        <w:t>Look for a response along the lines of: “Curtis points out that at the founding, Black citizens in several states could even…”</w:t>
+      </w:r>
+    </w:p>
+    <w:p>
+      <w:r>
+        <w:rPr>
+          <w:b/>
+          <w:color w:val="B1442F"/>
+          <w:sz w:val="22"/>
+        </w:rPr>
+        <w:t xml:space="preserve">QUESTION 3:  </w:t>
+      </w:r>
+      <w:r>
+        <w:rPr>
+          <w:b/>
+          <w:sz w:val="22"/>
+        </w:rPr>
+        <w:t>Correct — C. because if slavery couldn't be banned in any territory, no law or vote could keep it out</w:t>
+      </w:r>
+    </w:p>
+    <w:p>
+      <w:pPr>
+        <w:ind w:left="432"/>
+      </w:pPr>
+      <w:r>
+        <w:rPr>
+          <w:i/>
+          <w:color w:val="6A6256"/>
+          <w:sz w:val="21"/>
+        </w:rPr>
+        <w:t>Exactly. If Congress itself can't ban slavery in a territory, then neither a federal law (the Missouri Compromise) nor a territory's own vote (popular sovereignty) can keep slavery out. The Court said slavery could go anywhere.</w:t>
+      </w:r>
+    </w:p>
+    <w:p>
+      <w:r>
+        <w:rPr>
+          <w:b/>
+          <w:color w:val="B1442F"/>
+          <w:sz w:val="22"/>
+        </w:rPr>
+        <w:t xml:space="preserve">QUESTION 4:  </w:t>
+      </w:r>
+      <w:r>
+        <w:rPr>
+          <w:sz w:val="22"/>
+        </w:rPr>
+        <w:t>Open response.</w:t>
+      </w:r>
+    </w:p>
+    <w:p>
+      <w:pPr>
+        <w:ind w:left="432"/>
+      </w:pPr>
+      <w:r>
+        <w:rPr>
+          <w:i/>
+          <w:color w:val="6A6256"/>
+          <w:sz w:val="21"/>
+        </w:rPr>
+        <w:t>Look for a response along the lines of: “The ruling backfired because…”</w:t>
+      </w:r>
+    </w:p>
     <w:sectPr>
       <w:pgSz w:w="12240" w:h="15840"/>
-      <w:pgMar w:top="1152" w:right="1152" w:bottom="1152" w:left="1152" w:header="720" w:footer="720" w:gutter="0"/>
+      <w:pgMar w:top="1008" w:right="1008" w:bottom="1008" w:left="1008" w:header="720" w:footer="720" w:gutter="0"/>
       <w:cols w:space="720"/>
       <w:docGrid w:linePitch="360"/>
     </w:sectPr>

</xml_diff>